<commit_message>
Update user manual for member management, security, and case deletion
The Word manual still described /users as a name-only directory
requiring manual Firebase Console account creation, and had no
mention of the admin-only case deletion feature or the security
hardening added since it was first written. Refreshed those sections
and added a security-overview section covering the new access
controls.
</commit_message>
<xml_diff>
--- a/docs/TMHCC-User-Manual.docx
+++ b/docs/TMHCC-User-Manual.docx
@@ -204,7 +204,7 @@
           <w:b w:val="0"/>
           <w:sz w:val="22"/>
         </w:rPr>
-        <w:t>9. การตั้งค่ากลุ่ม LINE ต่อหน่วยงาน (/units)</w:t>
+        <w:t>9. การตั้งค่ากลุ่ม LINE ต่อหน่วยงาน (/units) — เฉพาะ Admin</w:t>
       </w:r>
     </w:p>
     <w:p>
@@ -217,7 +217,7 @@
           <w:b w:val="0"/>
           <w:sz w:val="22"/>
         </w:rPr>
-        <w:t>10. การจัดการรายชื่อบุคลากร (/users)</w:t>
+        <w:t>10. การลบเคส (เฉพาะ Admin)</w:t>
       </w:r>
     </w:p>
     <w:p>
@@ -230,7 +230,33 @@
           <w:b w:val="0"/>
           <w:sz w:val="22"/>
         </w:rPr>
-        <w:t>11. คำถามที่พบบ่อย</w:t>
+        <w:t>11. การจัดการสมาชิกและบัญชีผู้ใช้งาน (/users) — เฉพาะ Admin</w:t>
+      </w:r>
+    </w:p>
+    <w:p>
+      <w:pPr>
+        <w:pStyle w:val="ListBullet"/>
+      </w:pPr>
+      <w:r>
+        <w:rPr>
+          <w:rFonts w:ascii="Leelawadee UI" w:hAnsi="Leelawadee UI" w:cs="Leelawadee UI" w:eastAsia="Leelawadee UI"/>
+          <w:b w:val="0"/>
+          <w:sz w:val="22"/>
+        </w:rPr>
+        <w:t>12. ระบบความปลอดภัยของข้อมูล</w:t>
+      </w:r>
+    </w:p>
+    <w:p>
+      <w:pPr>
+        <w:pStyle w:val="ListBullet"/>
+      </w:pPr>
+      <w:r>
+        <w:rPr>
+          <w:rFonts w:ascii="Leelawadee UI" w:hAnsi="Leelawadee UI" w:cs="Leelawadee UI" w:eastAsia="Leelawadee UI"/>
+          <w:b w:val="0"/>
+          <w:sz w:val="22"/>
+        </w:rPr>
+        <w:t>13. คำถามที่พบบ่อย</w:t>
       </w:r>
     </w:p>
     <w:p>
@@ -660,7 +686,7 @@
           <w:b w:val="0"/>
           <w:sz w:val="22"/>
         </w:rPr>
-        <w:t>กรอกอีเมลและรหัสผ่านที่เจ้าหน้าที่ผู้ดูแลระบบสร้างให้</w:t>
+        <w:t>กรอกอีเมลและรหัสผ่านที่ผู้ดูแลระบบ (Admin) สร้างบัญชีให้ผ่านหน้า "จัดการสมาชิก" (/users)</w:t>
       </w:r>
     </w:p>
     <w:p>
@@ -694,7 +720,7 @@
           <w:b w:val="0"/>
           <w:sz w:val="21"/>
         </w:rPr>
-        <w:t>หมายเหตุสำหรับผู้ดูแลระบบ: การสร้างบัญชีผู้ใช้งานใหม่ต้องทำผ่าน Firebase Console โดยตรง (Authentication → Add User) แล้วเพิ่มข้อมูลชื่อ/บทบาทใน Firestore collection users โดยใช้ Document ID เป็น UID เดียวกับที่สร้างไว้ — หน้า "จัดการผู้ใช้งาน" ในเว็บ (/users) เป็นเพียงสมุดรายชื่อบุคลากร ไม่ได้สร้างบัญชี Login ให้อัตโนมัติ</w:t>
+        <w:t>หมายเหตุสำหรับผู้ดูแลระบบ: บัญชีผู้ใช้งานใหม่ทั้งหมดสร้างได้จากหน้าเว็บโดยตรงที่ /users (ต้องล็อกอินด้วยบัญชี role=ADMIN) โดยกรอกชื่อ อีเมล และรหัสผ่านเริ่มต้น ระบบจะสร้างบัญชี Login จริงให้ทันที ไม่ต้องเข้า Firebase Console อีกต่อไป (ดูรายละเอียดที่หัวข้อ 11) ยกเว้นกรณีที่ยังไม่มีบัญชี Admin คนแรกในระบบเลย ซึ่งต้องสร้างผ่าน Firebase Console ครั้งแรกเพียงครั้งเดียว</w:t>
       </w:r>
     </w:p>
     <w:p>
@@ -707,7 +733,7 @@
           <w:b w:val="0"/>
           <w:sz w:val="22"/>
         </w:rPr>
-        <w:t>เมื่อล็อกอินสำเร็จ จะเห็นแถบเมนูด้านบนของทุกหน้า ประกอบด้วย 📊 แดชบอร์ด · 🚨 เปิดเหตุ · 📋 ติดตาม SOP และปุ่ม "ออกจากระบบ" ที่มุมขวา</w:t>
+        <w:t>เมื่อล็อกอินสำเร็จ จะเห็นแถบเมนูด้านบนของทุกหน้า ประกอบด้วย 📊 แดชบอร์ด · 🚨 เปิดเหตุ · 📋 ติดตาม SOP และปุ่ม "ออกจากระบบ" ที่มุมขวา (บัญชี Admin จะเห็นเมนูเพิ่มเติมสำหรับตั้งค่ากลุ่ม LINE และจัดการสมาชิก)</w:t>
       </w:r>
     </w:p>
     <w:p>
@@ -1986,6 +2012,27 @@
     </w:p>
     <w:p>
       <w:pPr>
+        <w:spacing w:before="120" w:after="200"/>
+        <w:ind w:left="170" w:right="170"/>
+        <w:shd w:val="clear" w:color="auto" w:fill="FEF2F2"/>
+        <w:pBdr>
+          <w:top w:val="single" w:sz="6" w:space="4" w:color="FECACA"/>
+          <w:bottom w:val="single" w:sz="6" w:space="4" w:color="FECACA"/>
+          <w:left w:val="single" w:sz="6" w:space="4" w:color="FECACA"/>
+          <w:right w:val="single" w:sz="6" w:space="4" w:color="FECACA"/>
+        </w:pBdr>
+      </w:pPr>
+      <w:r>
+        <w:rPr>
+          <w:rFonts w:ascii="Leelawadee UI" w:hAnsi="Leelawadee UI" w:cs="Leelawadee UI" w:eastAsia="Leelawadee UI"/>
+          <w:b w:val="0"/>
+          <w:sz w:val="21"/>
+        </w:rPr>
+        <w:t>หน้านี้จำกัดสิทธิ์เฉพาะบัญชี role=ADMIN เท่านั้น — บัญชีอื่นที่เข้ามาที่ URL นี้จะเห็นข้อความแจ้งว่าไม่มีสิทธิ์เข้าใช้งาน</w:t>
+      </w:r>
+    </w:p>
+    <w:p>
+      <w:pPr>
         <w:spacing w:after="120"/>
       </w:pPr>
       <w:r>
@@ -1994,7 +2041,7 @@
           <w:b w:val="0"/>
           <w:sz w:val="22"/>
         </w:rPr>
-        <w:t>หน้าสำหรับผู้ดูแลระบบเท่านั้น ใช้ผูก Group ID ของ LINE แต่ละหน่วยงานเข้ากับระบบ</w:t>
+        <w:t>ใช้ผูก Group ID ของ LINE แต่ละหน่วยงานเข้ากับระบบ</w:t>
       </w:r>
     </w:p>
     <w:p>
@@ -2089,7 +2136,7 @@
           <w:color w:val="0F172A"/>
           <w:sz w:val="36"/>
         </w:rPr>
-        <w:t>10. การจัดการรายชื่อบุคลากร (/users)</w:t>
+        <w:t>10. การลบเคส (เฉพาะ Admin)</w:t>
       </w:r>
     </w:p>
     <w:p>
@@ -2102,7 +2149,46 @@
           <w:b w:val="0"/>
           <w:sz w:val="22"/>
         </w:rPr>
-        <w:t>หน้านี้ใช้บันทึกรายชื่อเจ้าหน้าที่/บุคลากรที่เกี่ยวข้อง (ชื่อ-นามสกุล, บทบาท, พื้นที่รับผิดชอบ) เพื่อเป็นทะเบียนอ้างอิง</w:t>
+        <w:t>กรณีเปิดเคสผิดพลาด หรือเป็นเคสทดสอบที่ต้องการล้างออกจากระบบ บัญชี Admin สามารถลบเคสทั้งเคสได้จากหน้ารายละเอียดเหตุการณ์</w:t>
+      </w:r>
+    </w:p>
+    <w:p>
+      <w:pPr>
+        <w:pStyle w:val="ListNumber"/>
+      </w:pPr>
+      <w:r>
+        <w:rPr>
+          <w:rFonts w:ascii="Leelawadee UI" w:hAnsi="Leelawadee UI" w:cs="Leelawadee UI" w:eastAsia="Leelawadee UI"/>
+          <w:b w:val="0"/>
+          <w:sz w:val="22"/>
+        </w:rPr>
+        <w:t>เปิดหน้ารายละเอียดเหตุการณ์ (กดที่รหัสเคสจากแดชบอร์ด)</w:t>
+      </w:r>
+    </w:p>
+    <w:p>
+      <w:pPr>
+        <w:pStyle w:val="ListNumber"/>
+      </w:pPr>
+      <w:r>
+        <w:rPr>
+          <w:rFonts w:ascii="Leelawadee UI" w:hAnsi="Leelawadee UI" w:cs="Leelawadee UI" w:eastAsia="Leelawadee UI"/>
+          <w:b w:val="0"/>
+          <w:sz w:val="22"/>
+        </w:rPr>
+        <w:t>เลื่อนลงไปด้านล่างสุด จะเห็นกรอบ "⚠️ พื้นที่อันตราย (เฉพาะ Admin)" — กรอบนี้แสดงเฉพาะบัญชี role=ADMIN เท่านั้น</w:t>
+      </w:r>
+    </w:p>
+    <w:p>
+      <w:pPr>
+        <w:pStyle w:val="ListNumber"/>
+      </w:pPr>
+      <w:r>
+        <w:rPr>
+          <w:rFonts w:ascii="Leelawadee UI" w:hAnsi="Leelawadee UI" w:cs="Leelawadee UI" w:eastAsia="Leelawadee UI"/>
+          <w:b w:val="0"/>
+          <w:sz w:val="22"/>
+        </w:rPr>
+        <w:t>กดปุ่ม "🗑️ ลบเคสนี้" แล้วยืนยันอีกครั้งในกล่องข้อความ</w:t>
       </w:r>
     </w:p>
     <w:p>
@@ -2123,7 +2209,12 @@
           <w:b w:val="0"/>
           <w:sz w:val="21"/>
         </w:rPr>
-        <w:t>ข้อจำกัดสำคัญ: การเพิ่มรายชื่อในหน้านี้ไม่ได้สร้างบัญชี Login ให้อัตโนมัติ เป็นเพียงสมุดรายชื่อ หากต้องการให้บุคคลนั้น Login เข้าเว็บได้จริง ต้องไปสร้างบัญชีผ่าน Firebase Console แยกต่างหาก (ดูหัวข้อ 2)</w:t>
+        <w:t>คำเตือน: การลบเคสจะลบข้อมูลเหตุการณ์และภารกิจ SOP ทั้งหมดของเคสนั้นออกจากฐานข้อมูลถาวร ไม่สามารถกู้คืนได้ ควรใช้เฉพาะกรณีเคสทดสอบหรือเปิดผิดพลาดจริงๆ เท่านั้น</w:t>
+      </w:r>
+    </w:p>
+    <w:p>
+      <w:r>
+        <w:br w:type="page"/>
       </w:r>
     </w:p>
     <w:p>
@@ -2140,7 +2231,492 @@
           <w:color w:val="0F172A"/>
           <w:sz w:val="36"/>
         </w:rPr>
-        <w:t>11. คำถามที่พบบ่อย</w:t>
+        <w:t>11. การจัดการสมาชิกและบัญชีผู้ใช้งาน (/users)</w:t>
+      </w:r>
+    </w:p>
+    <w:p>
+      <w:pPr>
+        <w:spacing w:before="120" w:after="200"/>
+        <w:ind w:left="170" w:right="170"/>
+        <w:shd w:val="clear" w:color="auto" w:fill="FEF2F2"/>
+        <w:pBdr>
+          <w:top w:val="single" w:sz="6" w:space="4" w:color="FECACA"/>
+          <w:bottom w:val="single" w:sz="6" w:space="4" w:color="FECACA"/>
+          <w:left w:val="single" w:sz="6" w:space="4" w:color="FECACA"/>
+          <w:right w:val="single" w:sz="6" w:space="4" w:color="FECACA"/>
+        </w:pBdr>
+      </w:pPr>
+      <w:r>
+        <w:rPr>
+          <w:rFonts w:ascii="Leelawadee UI" w:hAnsi="Leelawadee UI" w:cs="Leelawadee UI" w:eastAsia="Leelawadee UI"/>
+          <w:b w:val="0"/>
+          <w:sz w:val="21"/>
+        </w:rPr>
+        <w:t>หน้านี้จำกัดสิทธิ์เฉพาะบัญชี role=ADMIN เท่านั้น — บัญชีอื่นที่เข้ามาที่ URL นี้จะเห็นข้อความแจ้งว่าไม่มีสิทธิ์เข้าใช้งาน</w:t>
+      </w:r>
+    </w:p>
+    <w:p>
+      <w:pPr>
+        <w:spacing w:after="120"/>
+      </w:pPr>
+      <w:r>
+        <w:rPr>
+          <w:rFonts w:ascii="Leelawadee UI" w:hAnsi="Leelawadee UI" w:cs="Leelawadee UI" w:eastAsia="Leelawadee UI"/>
+          <w:b w:val="0"/>
+          <w:sz w:val="22"/>
+        </w:rPr>
+        <w:t>ใช้เพิ่ม/ลบบัญชีผู้ใช้งานจริงของระบบ พร้อมกำหนดบทบาท (Role) และพื้นที่รับผิดชอบ</w:t>
+      </w:r>
+    </w:p>
+    <w:p>
+      <w:pPr>
+        <w:spacing w:after="120"/>
+      </w:pPr>
+      <w:r>
+        <w:rPr>
+          <w:rFonts w:ascii="Leelawadee UI" w:hAnsi="Leelawadee UI" w:cs="Leelawadee UI" w:eastAsia="Leelawadee UI"/>
+          <w:b/>
+          <w:color w:val="1D4ED8"/>
+          <w:sz w:val="28"/>
+        </w:rPr>
+        <w:t>11.1 เพิ่มสมาชิกใหม่</w:t>
+      </w:r>
+    </w:p>
+    <w:p>
+      <w:pPr>
+        <w:pStyle w:val="ListNumber"/>
+      </w:pPr>
+      <w:r>
+        <w:rPr>
+          <w:rFonts w:ascii="Leelawadee UI" w:hAnsi="Leelawadee UI" w:cs="Leelawadee UI" w:eastAsia="Leelawadee UI"/>
+          <w:b w:val="0"/>
+          <w:sz w:val="22"/>
+        </w:rPr>
+        <w:t>กรอกชื่อ-นามสกุล, เลือกบทบาท (อสม. / รพ.สต. / ผู้บริหาร-Admin), พื้นที่รับผิดชอบ</w:t>
+      </w:r>
+    </w:p>
+    <w:p>
+      <w:pPr>
+        <w:pStyle w:val="ListNumber"/>
+      </w:pPr>
+      <w:r>
+        <w:rPr>
+          <w:rFonts w:ascii="Leelawadee UI" w:hAnsi="Leelawadee UI" w:cs="Leelawadee UI" w:eastAsia="Leelawadee UI"/>
+          <w:b w:val="0"/>
+          <w:sz w:val="22"/>
+        </w:rPr>
+        <w:t>กรอกอีเมลและรหัสผ่านเริ่มต้น (อย่างน้อย 6 ตัวอักษร) สำหรับให้คนนั้นใช้ล็อกอิน</w:t>
+      </w:r>
+    </w:p>
+    <w:p>
+      <w:pPr>
+        <w:pStyle w:val="ListNumber"/>
+      </w:pPr>
+      <w:r>
+        <w:rPr>
+          <w:rFonts w:ascii="Leelawadee UI" w:hAnsi="Leelawadee UI" w:cs="Leelawadee UI" w:eastAsia="Leelawadee UI"/>
+          <w:b w:val="0"/>
+          <w:sz w:val="22"/>
+        </w:rPr>
+        <w:t>กด "+ เพิ่มสมาชิก" — ระบบจะสร้างบัญชี Login จริงทันที พร้อมข้อมูลบทบาทในฐานข้อมูล</w:t>
+      </w:r>
+    </w:p>
+    <w:p>
+      <w:pPr>
+        <w:pStyle w:val="ListNumber"/>
+      </w:pPr>
+      <w:r>
+        <w:rPr>
+          <w:rFonts w:ascii="Leelawadee UI" w:hAnsi="Leelawadee UI" w:cs="Leelawadee UI" w:eastAsia="Leelawadee UI"/>
+          <w:b w:val="0"/>
+          <w:sz w:val="22"/>
+        </w:rPr>
+        <w:t>แจ้งอีเมล/รหัสผ่านนี้ให้สมาชิกใหม่ทราบเอง เพื่อนำไปล็อกอินเข้าเว็บได้เลย</w:t>
+      </w:r>
+    </w:p>
+    <w:p>
+      <w:pPr>
+        <w:spacing w:after="120"/>
+      </w:pPr>
+      <w:r>
+        <w:rPr>
+          <w:rFonts w:ascii="Leelawadee UI" w:hAnsi="Leelawadee UI" w:cs="Leelawadee UI" w:eastAsia="Leelawadee UI"/>
+          <w:b/>
+          <w:color w:val="1D4ED8"/>
+          <w:sz w:val="28"/>
+        </w:rPr>
+        <w:t>11.2 ลบสมาชิก</w:t>
+      </w:r>
+    </w:p>
+    <w:p>
+      <w:pPr>
+        <w:spacing w:after="120"/>
+      </w:pPr>
+      <w:r>
+        <w:rPr>
+          <w:rFonts w:ascii="Leelawadee UI" w:hAnsi="Leelawadee UI" w:cs="Leelawadee UI" w:eastAsia="Leelawadee UI"/>
+          <w:b w:val="0"/>
+          <w:sz w:val="22"/>
+        </w:rPr>
+        <w:t>กดปุ่ม "ลบ" ท้ายแถวของรายชื่อนั้น แล้วยืนยัน — ระบบจะลบทั้งข้อมูลในฐานข้อมูลและบัญชี Login ออกพร้อมกัน ทำให้คนนั้นล็อกอินเข้าระบบไม่ได้อีกทันที</w:t>
+      </w:r>
+    </w:p>
+    <w:p>
+      <w:pPr>
+        <w:spacing w:before="120" w:after="200"/>
+        <w:ind w:left="170" w:right="170"/>
+        <w:shd w:val="clear" w:color="auto" w:fill="FFFBEB"/>
+        <w:pBdr>
+          <w:top w:val="single" w:sz="6" w:space="4" w:color="FDE68A"/>
+          <w:bottom w:val="single" w:sz="6" w:space="4" w:color="FDE68A"/>
+          <w:left w:val="single" w:sz="6" w:space="4" w:color="FDE68A"/>
+          <w:right w:val="single" w:sz="6" w:space="4" w:color="FDE68A"/>
+        </w:pBdr>
+      </w:pPr>
+      <w:r>
+        <w:rPr>
+          <w:rFonts w:ascii="Leelawadee UI" w:hAnsi="Leelawadee UI" w:cs="Leelawadee UI" w:eastAsia="Leelawadee UI"/>
+          <w:b w:val="0"/>
+          <w:sz w:val="21"/>
+        </w:rPr>
+        <w:t>ข้อจำกัดด้านความปลอดภัย: ไม่สามารถลบบัญชีของตัวเองได้ (ปุ่ม "ลบ" จะถูกปิดใช้งานในแถวของตัวเอง) เพื่อป้องกันไม่ให้ผู้ดูแลระบบล็อกตัวเองออกจากระบบโดยไม่ตั้งใจ</w:t>
+      </w:r>
+    </w:p>
+    <w:p>
+      <w:r>
+        <w:br w:type="page"/>
+      </w:r>
+    </w:p>
+    <w:p>
+      <w:pPr>
+        <w:spacing w:before="120" w:after="200"/>
+        <w:pBdr>
+          <w:bottom w:val="single" w:sz="18" w:space="4" w:color="2563EB"/>
+        </w:pBdr>
+      </w:pPr>
+      <w:r>
+        <w:rPr>
+          <w:rFonts w:ascii="Leelawadee UI" w:hAnsi="Leelawadee UI" w:cs="Leelawadee UI" w:eastAsia="Leelawadee UI"/>
+          <w:b/>
+          <w:color w:val="0F172A"/>
+          <w:sz w:val="36"/>
+        </w:rPr>
+        <w:t>12. ระบบความปลอดภัยของข้อมูล</w:t>
+      </w:r>
+    </w:p>
+    <w:p>
+      <w:pPr>
+        <w:spacing w:after="120"/>
+      </w:pPr>
+      <w:r>
+        <w:rPr>
+          <w:rFonts w:ascii="Leelawadee UI" w:hAnsi="Leelawadee UI" w:cs="Leelawadee UI" w:eastAsia="Leelawadee UI"/>
+          <w:b w:val="0"/>
+          <w:sz w:val="22"/>
+        </w:rPr>
+        <w:t>ระบบมีการป้องกันหลายชั้น เพื่อไม่ให้ผู้ไม่มีสิทธิ์เข้าถึงหรือแก้ไขข้อมูลที่อ่อนไหวได้:</w:t>
+      </w:r>
+    </w:p>
+    <w:tbl>
+      <w:tblPr>
+        <w:tblStyle w:val="TableGrid"/>
+        <w:tblW w:type="auto" w:w="0"/>
+        <w:jc w:val="center"/>
+        <w:tblLook w:firstColumn="1" w:firstRow="1" w:lastColumn="0" w:lastRow="0" w:noHBand="0" w:noVBand="1" w:val="04A0"/>
+      </w:tblPr>
+      <w:tblGrid>
+        <w:gridCol w:w="4933"/>
+        <w:gridCol w:w="4933"/>
+      </w:tblGrid>
+      <w:tr>
+        <w:tc>
+          <w:tcPr>
+            <w:tcW w:type="dxa" w:w="4933"/>
+            <w:shd w:val="clear" w:color="auto" w:fill="F1F5F9"/>
+          </w:tcPr>
+          <w:p>
+            <w:r/>
+            <w:r>
+              <w:rPr>
+                <w:rFonts w:ascii="Leelawadee UI" w:hAnsi="Leelawadee UI" w:cs="Leelawadee UI" w:eastAsia="Leelawadee UI"/>
+                <w:b/>
+                <w:color w:val="334155"/>
+                <w:sz w:val="21"/>
+              </w:rPr>
+              <w:t>จุดที่ป้องกัน</w:t>
+            </w:r>
+          </w:p>
+        </w:tc>
+        <w:tc>
+          <w:tcPr>
+            <w:tcW w:type="dxa" w:w="4933"/>
+            <w:shd w:val="clear" w:color="auto" w:fill="F1F5F9"/>
+          </w:tcPr>
+          <w:p>
+            <w:r/>
+            <w:r>
+              <w:rPr>
+                <w:rFonts w:ascii="Leelawadee UI" w:hAnsi="Leelawadee UI" w:cs="Leelawadee UI" w:eastAsia="Leelawadee UI"/>
+                <w:b/>
+                <w:color w:val="334155"/>
+                <w:sz w:val="21"/>
+              </w:rPr>
+              <w:t>วิธีป้องกัน</w:t>
+            </w:r>
+          </w:p>
+        </w:tc>
+      </w:tr>
+      <w:tr>
+        <w:tc>
+          <w:tcPr>
+            <w:tcW w:type="dxa" w:w="4933"/>
+          </w:tcPr>
+          <w:p>
+            <w:r/>
+            <w:r>
+              <w:rPr>
+                <w:rFonts w:ascii="Leelawadee UI" w:hAnsi="Leelawadee UI" w:cs="Leelawadee UI" w:eastAsia="Leelawadee UI"/>
+                <w:b w:val="0"/>
+                <w:sz w:val="21"/>
+              </w:rPr>
+              <w:t>ทุกหน้าในเว็บ</w:t>
+            </w:r>
+          </w:p>
+        </w:tc>
+        <w:tc>
+          <w:tcPr>
+            <w:tcW w:type="dxa" w:w="4933"/>
+          </w:tcPr>
+          <w:p>
+            <w:r/>
+            <w:r>
+              <w:rPr>
+                <w:rFonts w:ascii="Leelawadee UI" w:hAnsi="Leelawadee UI" w:cs="Leelawadee UI" w:eastAsia="Leelawadee UI"/>
+                <w:b w:val="0"/>
+                <w:sz w:val="21"/>
+              </w:rPr>
+              <w:t>ต้องล็อกอินผ่าน Firebase Auth ก่อนเสมอ ไม่มีหน้าใดเปิดเป็นสาธารณะ</w:t>
+            </w:r>
+          </w:p>
+        </w:tc>
+      </w:tr>
+      <w:tr>
+        <w:tc>
+          <w:tcPr>
+            <w:tcW w:type="dxa" w:w="4933"/>
+          </w:tcPr>
+          <w:p>
+            <w:r/>
+            <w:r>
+              <w:rPr>
+                <w:rFonts w:ascii="Leelawadee UI" w:hAnsi="Leelawadee UI" w:cs="Leelawadee UI" w:eastAsia="Leelawadee UI"/>
+                <w:b w:val="0"/>
+                <w:sz w:val="21"/>
+              </w:rPr>
+              <w:t>หน้า /users และ /units</w:t>
+            </w:r>
+          </w:p>
+        </w:tc>
+        <w:tc>
+          <w:tcPr>
+            <w:tcW w:type="dxa" w:w="4933"/>
+          </w:tcPr>
+          <w:p>
+            <w:r/>
+            <w:r>
+              <w:rPr>
+                <w:rFonts w:ascii="Leelawadee UI" w:hAnsi="Leelawadee UI" w:cs="Leelawadee UI" w:eastAsia="Leelawadee UI"/>
+                <w:b w:val="0"/>
+                <w:sz w:val="21"/>
+              </w:rPr>
+              <w:t>ตรวจสอบสิทธิ์ role=ADMIN ทั้งฝั่งหน้าจอและฝั่งเซิร์ฟเวอร์ ไม่ใช่ซ่อนปุ่มไว้เฉยๆ</w:t>
+            </w:r>
+          </w:p>
+        </w:tc>
+      </w:tr>
+      <w:tr>
+        <w:tc>
+          <w:tcPr>
+            <w:tcW w:type="dxa" w:w="4933"/>
+          </w:tcPr>
+          <w:p>
+            <w:r/>
+            <w:r>
+              <w:rPr>
+                <w:rFonts w:ascii="Leelawadee UI" w:hAnsi="Leelawadee UI" w:cs="Leelawadee UI" w:eastAsia="Leelawadee UI"/>
+                <w:b w:val="0"/>
+                <w:sz w:val="21"/>
+              </w:rPr>
+              <w:t>การเพิ่ม/ลบสมาชิก และการลบเคส</w:t>
+            </w:r>
+          </w:p>
+        </w:tc>
+        <w:tc>
+          <w:tcPr>
+            <w:tcW w:type="dxa" w:w="4933"/>
+          </w:tcPr>
+          <w:p>
+            <w:r/>
+            <w:r>
+              <w:rPr>
+                <w:rFonts w:ascii="Leelawadee UI" w:hAnsi="Leelawadee UI" w:cs="Leelawadee UI" w:eastAsia="Leelawadee UI"/>
+                <w:b w:val="0"/>
+                <w:sz w:val="21"/>
+              </w:rPr>
+              <w:t>ประมวลผลฝั่งเซิร์ฟเวอร์เท่านั้น (Firebase Admin SDK) พร้อมตรวจสอบ token และ role ของผู้เรียกทุกครั้งก่อนทำรายการ</w:t>
+            </w:r>
+          </w:p>
+        </w:tc>
+      </w:tr>
+      <w:tr>
+        <w:tc>
+          <w:tcPr>
+            <w:tcW w:type="dxa" w:w="4933"/>
+          </w:tcPr>
+          <w:p>
+            <w:r/>
+            <w:r>
+              <w:rPr>
+                <w:rFonts w:ascii="Leelawadee UI" w:hAnsi="Leelawadee UI" w:cs="Leelawadee UI" w:eastAsia="Leelawadee UI"/>
+                <w:b w:val="0"/>
+                <w:sz w:val="21"/>
+              </w:rPr>
+              <w:t>ฟอร์มเปิดเหตุจากกลุ่มไลน์ (LIFF)</w:t>
+            </w:r>
+          </w:p>
+        </w:tc>
+        <w:tc>
+          <w:tcPr>
+            <w:tcW w:type="dxa" w:w="4933"/>
+          </w:tcPr>
+          <w:p>
+            <w:r/>
+            <w:r>
+              <w:rPr>
+                <w:rFonts w:ascii="Leelawadee UI" w:hAnsi="Leelawadee UI" w:cs="Leelawadee UI" w:eastAsia="Leelawadee UI"/>
+                <w:b w:val="0"/>
+                <w:sz w:val="21"/>
+              </w:rPr>
+              <w:t>ตรวจสอบ Access Token ของผู้ใช้กับ LINE ก่อนบันทึกข้อมูลทุกครั้ง ป้องกันการปลอมแปลงคำขอ</w:t>
+            </w:r>
+          </w:p>
+        </w:tc>
+      </w:tr>
+      <w:tr>
+        <w:tc>
+          <w:tcPr>
+            <w:tcW w:type="dxa" w:w="4933"/>
+          </w:tcPr>
+          <w:p>
+            <w:r/>
+            <w:r>
+              <w:rPr>
+                <w:rFonts w:ascii="Leelawadee UI" w:hAnsi="Leelawadee UI" w:cs="Leelawadee UI" w:eastAsia="Leelawadee UI"/>
+                <w:b w:val="0"/>
+                <w:sz w:val="21"/>
+              </w:rPr>
+              <w:t>Webhook รับข้อความจากไลน์</w:t>
+            </w:r>
+          </w:p>
+        </w:tc>
+        <w:tc>
+          <w:tcPr>
+            <w:tcW w:type="dxa" w:w="4933"/>
+          </w:tcPr>
+          <w:p>
+            <w:r/>
+            <w:r>
+              <w:rPr>
+                <w:rFonts w:ascii="Leelawadee UI" w:hAnsi="Leelawadee UI" w:cs="Leelawadee UI" w:eastAsia="Leelawadee UI"/>
+                <w:b w:val="0"/>
+                <w:sz w:val="21"/>
+              </w:rPr>
+              <w:t>ตรวจลายเซ็นดิจิทัล (Signature) ของทุกคำขอที่ส่งเข้ามา เพื่อยืนยันว่ามาจาก LINE จริง</w:t>
+            </w:r>
+          </w:p>
+        </w:tc>
+      </w:tr>
+      <w:tr>
+        <w:tc>
+          <w:tcPr>
+            <w:tcW w:type="dxa" w:w="4933"/>
+          </w:tcPr>
+          <w:p>
+            <w:r/>
+            <w:r>
+              <w:rPr>
+                <w:rFonts w:ascii="Leelawadee UI" w:hAnsi="Leelawadee UI" w:cs="Leelawadee UI" w:eastAsia="Leelawadee UI"/>
+                <w:b w:val="0"/>
+                <w:sz w:val="21"/>
+              </w:rPr>
+              <w:t>ฐานข้อมูล Firestore</w:t>
+            </w:r>
+          </w:p>
+        </w:tc>
+        <w:tc>
+          <w:tcPr>
+            <w:tcW w:type="dxa" w:w="4933"/>
+          </w:tcPr>
+          <w:p>
+            <w:r/>
+            <w:r>
+              <w:rPr>
+                <w:rFonts w:ascii="Leelawadee UI" w:hAnsi="Leelawadee UI" w:cs="Leelawadee UI" w:eastAsia="Leelawadee UI"/>
+                <w:b w:val="0"/>
+                <w:sz w:val="21"/>
+              </w:rPr>
+              <w:t>ตั้งกฎการเข้าถึง (Security Rules) ไว้ที่ตัวฐานข้อมูลโดยตรง เป็นชั้นป้องกันสุดท้ายที่ไม่ขึ้นกับหน้าเว็บ</w:t>
+            </w:r>
+          </w:p>
+        </w:tc>
+      </w:tr>
+    </w:tbl>
+    <w:p>
+      <w:pPr>
+        <w:spacing w:after="80"/>
+      </w:pPr>
+    </w:p>
+    <w:p>
+      <w:pPr>
+        <w:spacing w:before="120" w:after="200"/>
+        <w:ind w:left="170" w:right="170"/>
+        <w:shd w:val="clear" w:color="auto" w:fill="EFF6FF"/>
+        <w:pBdr>
+          <w:top w:val="single" w:sz="6" w:space="4" w:color="BFDBFE"/>
+          <w:bottom w:val="single" w:sz="6" w:space="4" w:color="BFDBFE"/>
+          <w:left w:val="single" w:sz="6" w:space="4" w:color="BFDBFE"/>
+          <w:right w:val="single" w:sz="6" w:space="4" w:color="BFDBFE"/>
+        </w:pBdr>
+      </w:pPr>
+      <w:r>
+        <w:rPr>
+          <w:rFonts w:ascii="Leelawadee UI" w:hAnsi="Leelawadee UI" w:cs="Leelawadee UI" w:eastAsia="Leelawadee UI"/>
+          <w:b w:val="0"/>
+          <w:sz w:val="21"/>
+        </w:rPr>
+        <w:t>การป้องกันเหล่านี้ทำงานร่วมกันหลายชั้น (Defense in Depth) — แม้ผู้ไม่หวังดีจะรู้ URL ของระบบจัดการ ก็ไม่สามารถ เรียกใช้งานได้หากไม่มีบัญชีที่มีสิทธิ์ Admin จริง</w:t>
+      </w:r>
+    </w:p>
+    <w:p>
+      <w:r>
+        <w:br w:type="page"/>
+      </w:r>
+    </w:p>
+    <w:p>
+      <w:pPr>
+        <w:spacing w:before="120" w:after="200"/>
+        <w:pBdr>
+          <w:bottom w:val="single" w:sz="18" w:space="4" w:color="2563EB"/>
+        </w:pBdr>
+      </w:pPr>
+      <w:r>
+        <w:rPr>
+          <w:rFonts w:ascii="Leelawadee UI" w:hAnsi="Leelawadee UI" w:cs="Leelawadee UI" w:eastAsia="Leelawadee UI"/>
+          <w:b/>
+          <w:color w:val="0F172A"/>
+          <w:sz w:val="36"/>
+        </w:rPr>
+        <w:t>13. คำถามที่พบบ่อย</w:t>
       </w:r>
     </w:p>
     <w:p>
@@ -2194,7 +2770,61 @@
           <w:b w:val="0"/>
           <w:sz w:val="22"/>
         </w:rPr>
-        <w:t>A: บัญชี Login มีอยู่จริง แต่ยังไม่มีข้อมูลคู่กันใน Firestore collection users ต้องให้ผู้ดูแลระบบเพิ่มให้ (ดูหัวข้อ 2)</w:t>
+        <w:t>A: บัญชี Login มีอยู่จริง แต่ยังไม่มีข้อมูลคู่กันใน Firestore collection users ต้องให้ผู้ดูแลระบบ (Admin) เพิ่มให้ผ่านหน้า /users</w:t>
+      </w:r>
+    </w:p>
+    <w:p>
+      <w:pPr>
+        <w:spacing w:after="80"/>
+      </w:pPr>
+      <w:r>
+        <w:rPr>
+          <w:rFonts w:ascii="Leelawadee UI" w:hAnsi="Leelawadee UI" w:cs="Leelawadee UI" w:eastAsia="Leelawadee UI"/>
+          <w:b/>
+          <w:color w:val="334155"/>
+          <w:sz w:val="25"/>
+        </w:rPr>
+        <w:t>Q: ยังไม่มีบัญชี Admin เลยสักคน จะเข้าหน้า /users เพื่อสร้างบัญชีแรกได้อย่างไร?</w:t>
+      </w:r>
+    </w:p>
+    <w:p>
+      <w:pPr>
+        <w:spacing w:after="120"/>
+      </w:pPr>
+      <w:r>
+        <w:rPr>
+          <w:rFonts w:ascii="Leelawadee UI" w:hAnsi="Leelawadee UI" w:cs="Leelawadee UI" w:eastAsia="Leelawadee UI"/>
+          <w:b w:val="0"/>
+          <w:sz w:val="22"/>
+        </w:rPr>
+        <w:t>A: หน้า /users เองก็ต้องใช้บัญชี Admin ในการเข้าถึง ดังนั้นบัญชี Admin คนแรกของระบบต้องถูกสร้างผ่าน Firebase Console โดยตรงเพียงครั้งเดียว (Authentication → Add User แล้วเพิ่ม document ใน Firestore collection users ที่มี role: "ADMIN") หลังจากนั้นบัญชี Admin คนแรกนี้จะสามารถเพิ่มสมาชิกคนอื่นๆ ผ่านหน้าเว็บได้ตามปกติ</w:t>
+      </w:r>
+    </w:p>
+    <w:p>
+      <w:pPr>
+        <w:spacing w:after="80"/>
+      </w:pPr>
+      <w:r>
+        <w:rPr>
+          <w:rFonts w:ascii="Leelawadee UI" w:hAnsi="Leelawadee UI" w:cs="Leelawadee UI" w:eastAsia="Leelawadee UI"/>
+          <w:b/>
+          <w:color w:val="334155"/>
+          <w:sz w:val="25"/>
+        </w:rPr>
+        <w:t>Q: ลบเคสไปแล้ว กู้คืนได้ไหม?</w:t>
+      </w:r>
+    </w:p>
+    <w:p>
+      <w:pPr>
+        <w:spacing w:after="120"/>
+      </w:pPr>
+      <w:r>
+        <w:rPr>
+          <w:rFonts w:ascii="Leelawadee UI" w:hAnsi="Leelawadee UI" w:cs="Leelawadee UI" w:eastAsia="Leelawadee UI"/>
+          <w:b w:val="0"/>
+          <w:sz w:val="22"/>
+        </w:rPr>
+        <w:t>A: ไม่ได้ การลบเคสเป็นการลบถาวรออกจากฐานข้อมูลทันที ควรตรวจสอบให้แน่ใจก่อนกดยืนยันทุกครั้ง</w:t>
       </w:r>
     </w:p>
     <w:p>

</xml_diff>